<commit_message>
Update Milestone 1 Report-Group5.docx
</commit_message>
<xml_diff>
--- a/Milestone 1 Report-Group5.docx
+++ b/Milestone 1 Report-Group5.docx
@@ -755,20 +755,19 @@
           <w:lang w:val="en-US"/>
         </w:rPr>
       </w:pPr>
-    </w:p>
-    <w:p>
-      <w:pPr>
-        <w:rPr>
-          <w:rFonts w:ascii="Century Schoolbook" w:hAnsi="Century Schoolbook"/>
-          <w:lang w:val="en-US"/>
-        </w:rPr>
-      </w:pPr>
-      <w:r>
-        <w:rPr>
-          <w:rFonts w:ascii="Century Schoolbook" w:hAnsi="Century Schoolbook"/>
-          <w:lang w:val="en-US"/>
-        </w:rPr>
-        <w:t>We made sure that we understand important concepts that help us implement this</w:t>
+      <w:r>
+        <w:rPr>
+          <w:rFonts w:ascii="Century Schoolbook" w:hAnsi="Century Schoolbook"/>
+          <w:lang w:val="en-US"/>
+        </w:rPr>
+        <w:t>We made sure that we understand important concepts that help us</w:t>
+      </w:r>
+      <w:r>
+        <w:rPr>
+          <w:rFonts w:ascii="Century Schoolbook" w:hAnsi="Century Schoolbook"/>
+          <w:lang w:val="en-US"/>
+        </w:rPr>
+        <w:t xml:space="preserve"> start this project.</w:t>
       </w:r>
     </w:p>
     <w:p>
@@ -1063,12 +1062,35 @@
       <w:r>
         <w:rPr>
           <w:rFonts w:ascii="Century Schoolbook" w:hAnsi="Century Schoolbook"/>
+          <w:lang w:val="en-US"/>
+        </w:rPr>
+        <w:lastRenderedPageBreak/>
+        <w:t>First thing after creating the repository I invited my team members to it using their GitHub accounts. We created a simple readme and a .gitignore for the visual paradigm and the word files as they are major concepts of GitHub.</w:t>
+      </w:r>
+    </w:p>
+    <w:p>
+      <w:pPr>
+        <w:rPr>
+          <w:rFonts w:ascii="Century Schoolbook" w:hAnsi="Century Schoolbook"/>
+          <w:lang w:val="en-US"/>
+        </w:rPr>
+      </w:pPr>
+    </w:p>
+    <w:p>
+      <w:pPr>
+        <w:rPr>
+          <w:rFonts w:ascii="Century Schoolbook" w:hAnsi="Century Schoolbook"/>
+          <w:lang w:val="en-US"/>
+        </w:rPr>
+      </w:pPr>
+      <w:r>
+        <w:rPr>
+          <w:rFonts w:ascii="Century Schoolbook" w:hAnsi="Century Schoolbook"/>
           <w:b/>
           <w:bCs/>
           <w:u w:val="single"/>
           <w:lang w:val="en-US"/>
         </w:rPr>
-        <w:lastRenderedPageBreak/>
         <w:t>2-</w:t>
       </w:r>
       <w:r>

</xml_diff>